<commit_message>
Update DTC contract with confirmed party details
Corrects vendor name to Mission Hub Ink and adds its confirmed Palm
Desert, CA address, sets the effective date to September 11, 2026,
notes DTC's 501(c)(3) application is pending (with a corresponding
donor tax-deductibility disclosure), and resolves governing law to
California / Riverside County.

Co-Authored-By: Claude Sonnet 5 <noreply@anthropic.com>
Claude-Session: https://claude.ai/code/session_01ARzF3gvMe1hgzDFCn9fbkn
</commit_message>
<xml_diff>
--- a/contracts/DTC-Website-Services-Agreement.docx
+++ b/contracts/DTC-Website-Services-Agreement.docx
@@ -79,74 +79,54 @@
           <w:bCs/>
           <w:sz w:val="22"/>
           <w:szCs w:val="22"/>
+        </w:rPr>
+        <w:t xml:space="preserve">September 11, 2026</w:t>
+      </w:r>
+      <w:r>
+        <w:rPr>
+          <w:sz w:val="22"/>
+          <w:szCs w:val="22"/>
+        </w:rPr>
+        <w:t xml:space="preserve"> (the “Effective Date”), by and between:</w:t>
+      </w:r>
+    </w:p>
+    <w:p>
+      <w:pPr>
+        <w:spacing w:after="140"/>
+      </w:pPr>
+      <w:r>
+        <w:rPr>
+          <w:b/>
+          <w:bCs/>
+          <w:sz w:val="22"/>
+          <w:szCs w:val="22"/>
+        </w:rPr>
+        <w:t xml:space="preserve">Mission Hub Ink</w:t>
+      </w:r>
+      <w:r>
+        <w:rPr>
+          <w:sz w:val="22"/>
+          <w:szCs w:val="22"/>
+        </w:rPr>
+        <w:t xml:space="preserve"> </w:t>
+      </w:r>
+      <w:r>
+        <w:rPr>
+          <w:b/>
+          <w:bCs/>
+          <w:sz w:val="22"/>
+          <w:szCs w:val="22"/>
           <w:highlight w:val="yellow"/>
           <w:highlightCs w:val="yellow"/>
         </w:rPr>
-        <w:t xml:space="preserve">[EFFECTIVE DATE]</w:t>
-      </w:r>
-      <w:r>
-        <w:rPr>
-          <w:sz w:val="22"/>
-          <w:szCs w:val="22"/>
-        </w:rPr>
-        <w:t xml:space="preserve"> (the “Effective Date”), by and between:</w:t>
-      </w:r>
-    </w:p>
-    <w:p>
-      <w:pPr>
-        <w:spacing w:after="140"/>
-      </w:pPr>
-      <w:r>
-        <w:rPr>
-          <w:b/>
-          <w:bCs/>
-          <w:sz w:val="22"/>
-          <w:szCs w:val="22"/>
-        </w:rPr>
-        <w:t xml:space="preserve">Mission Hub Inc.</w:t>
-      </w:r>
-      <w:r>
-        <w:rPr>
-          <w:sz w:val="22"/>
-          <w:szCs w:val="22"/>
-        </w:rPr>
-        <w:t xml:space="preserve">, a corporation organized under the laws of the State of </w:t>
-      </w:r>
-      <w:r>
-        <w:rPr>
-          <w:b/>
-          <w:bCs/>
-          <w:sz w:val="22"/>
-          <w:szCs w:val="22"/>
-          <w:highlight w:val="yellow"/>
-          <w:highlightCs w:val="yellow"/>
-        </w:rPr>
-        <w:t xml:space="preserve">[STATE OF FORMATION]</w:t>
-      </w:r>
-      <w:r>
-        <w:rPr>
-          <w:sz w:val="22"/>
-          <w:szCs w:val="22"/>
-        </w:rPr>
-        <w:t xml:space="preserve">, with a principal address of </w:t>
-      </w:r>
-      <w:r>
-        <w:rPr>
-          <w:b/>
-          <w:bCs/>
-          <w:sz w:val="22"/>
-          <w:szCs w:val="22"/>
-          <w:highlight w:val="yellow"/>
-          <w:highlightCs w:val="yellow"/>
-        </w:rPr>
-        <w:t xml:space="preserve">[MISSION HUB INC. ADDRESS]</w:t>
-      </w:r>
-      <w:r>
-        <w:rPr>
-          <w:sz w:val="22"/>
-          <w:szCs w:val="22"/>
-        </w:rPr>
-        <w:t xml:space="preserve"> (“Company”); and</w:t>
+        <w:t xml:space="preserve">[ENTITY TYPE — e.g., a California corporation / LLC / sole proprietorship — please confirm]</w:t>
+      </w:r>
+      <w:r>
+        <w:rPr>
+          <w:sz w:val="22"/>
+          <w:szCs w:val="22"/>
+        </w:rPr>
+        <w:t xml:space="preserve">, with a principal address of 77824 Wildcat Dr., Palm Desert, CA 92211 (“Company”); and</w:t>
       </w:r>
     </w:p>
     <w:p>
@@ -167,25 +147,7 @@
           <w:sz w:val="22"/>
           <w:szCs w:val="22"/>
         </w:rPr>
-        <w:t xml:space="preserve"> (“DTC” or “Client”), </w:t>
-      </w:r>
-      <w:r>
-        <w:rPr>
-          <w:b/>
-          <w:bCs/>
-          <w:sz w:val="22"/>
-          <w:szCs w:val="22"/>
-          <w:highlight w:val="yellow"/>
-          <w:highlightCs w:val="yellow"/>
-        </w:rPr>
-        <w:t xml:space="preserve">[a California nonprofit corporation / an unincorporated ministry / a fiscally-sponsored project of ______ — please confirm Client's exact legal status]</w:t>
-      </w:r>
-      <w:r>
-        <w:rPr>
-          <w:sz w:val="22"/>
-          <w:szCs w:val="22"/>
-        </w:rPr>
-        <w:t xml:space="preserve">, with a principal address of </w:t>
+        <w:t xml:space="preserve"> (“DTC” or “Client”), a nonprofit organization whose application for recognition of tax-exempt status under Section 501(c)(3) of the Internal Revenue Code is currently pending, with a principal address of </w:t>
       </w:r>
       <w:r>
         <w:rPr>
@@ -860,6 +822,28 @@
     </w:p>
     <w:p>
       <w:pPr>
+        <w:spacing w:after="140"/>
+        <w:ind w:left="360"/>
+      </w:pPr>
+      <w:r>
+        <w:rPr>
+          <w:b/>
+          <w:bCs/>
+          <w:sz w:val="22"/>
+          <w:szCs w:val="22"/>
+        </w:rPr>
+        <w:t xml:space="preserve">6.4 </w:t>
+      </w:r>
+      <w:r>
+        <w:rPr>
+          <w:sz w:val="22"/>
+          <w:szCs w:val="22"/>
+        </w:rPr>
+        <w:t xml:space="preserve">Client acknowledges that, as of the Effective Date, its application for 501(c)(3) tax-exempt status is pending and has not yet been granted. Client is solely responsible for any representations made to donors or the public regarding the tax-deductibility of contributions, and for updating Website content accordingly once, and unless, 501(c)(3) status is granted.</w:t>
+      </w:r>
+    </w:p>
+    <w:p>
+      <w:pPr>
         <w:spacing w:after="100" w:before="240"/>
       </w:pPr>
       <w:r>
@@ -1191,43 +1175,7 @@
           <w:sz w:val="22"/>
           <w:szCs w:val="22"/>
         </w:rPr>
-        <w:t xml:space="preserve">Governing Law; Venue. This Agreement is governed by the laws of the State of </w:t>
-      </w:r>
-      <w:r>
-        <w:rPr>
-          <w:b/>
-          <w:bCs/>
-          <w:sz w:val="22"/>
-          <w:szCs w:val="22"/>
-          <w:highlight w:val="yellow"/>
-          <w:highlightCs w:val="yellow"/>
-        </w:rPr>
-        <w:t xml:space="preserve">[GOVERNING STATE — e.g., California]</w:t>
-      </w:r>
-      <w:r>
-        <w:rPr>
-          <w:sz w:val="22"/>
-          <w:szCs w:val="22"/>
-        </w:rPr>
-        <w:t xml:space="preserve">, without regard to conflict-of-laws principles. Any dispute will be brought exclusively in the state or federal courts located in </w:t>
-      </w:r>
-      <w:r>
-        <w:rPr>
-          <w:b/>
-          <w:bCs/>
-          <w:sz w:val="22"/>
-          <w:szCs w:val="22"/>
-          <w:highlight w:val="yellow"/>
-          <w:highlightCs w:val="yellow"/>
-        </w:rPr>
-        <w:t xml:space="preserve">[COUNTY/STATE]</w:t>
-      </w:r>
-      <w:r>
-        <w:rPr>
-          <w:sz w:val="22"/>
-          <w:szCs w:val="22"/>
-        </w:rPr>
-        <w:t xml:space="preserve">, and each Party consents to jurisdiction and venue there.</w:t>
+        <w:t xml:space="preserve">Governing Law; Venue. This Agreement is governed by the laws of the State of California, without regard to conflict-of-laws principles. Any dispute will be brought exclusively in the state or federal courts located in Riverside County, California, and each Party consents to jurisdiction and venue there.</w:t>
       </w:r>
     </w:p>
     <w:p>
@@ -1431,7 +1379,7 @@
                 <w:sz w:val="20"/>
                 <w:szCs w:val="20"/>
               </w:rPr>
-              <w:t xml:space="preserve">Signature — Mission Hub Inc.</w:t>
+              <w:t xml:space="preserve">Signature — Mission Hub Ink</w:t>
             </w:r>
           </w:p>
         </w:tc>

</xml_diff>

<commit_message>
Correct party details: DTC address, Mission Hub Ink structure, payment methods
The Palm Desert address belongs to DTC (the charity), not Mission Hub
Ink. Mission Hub Ink is a sole proprietorship, so the agreement now
names it as owned/operated by an individual doing business under that
name, with a placeholder for the owner's legal name and address. Payment
terms updated: the $500 website fee is paid by check, the $250/month
maintenance fee via Stripe.

Co-Authored-By: Claude Sonnet 5 <noreply@anthropic.com>
Claude-Session: https://claude.ai/code/session_01ARzF3gvMe1hgzDFCn9fbkn
</commit_message>
<xml_diff>
--- a/contracts/DTC-Website-Services-Agreement.docx
+++ b/contracts/DTC-Website-Services-Agreement.docx
@@ -108,7 +108,7 @@
           <w:sz w:val="22"/>
           <w:szCs w:val="22"/>
         </w:rPr>
-        <w:t xml:space="preserve"> </w:t>
+        <w:t xml:space="preserve">, a sole proprietorship operating under the trade name “Mission Hub Ink,” owned and operated by </w:t>
       </w:r>
       <w:r>
         <w:rPr>
@@ -119,35 +119,14 @@
           <w:highlight w:val="yellow"/>
           <w:highlightCs w:val="yellow"/>
         </w:rPr>
-        <w:t xml:space="preserve">[ENTITY TYPE — e.g., a California corporation / LLC / sole proprietorship — please confirm]</w:t>
-      </w:r>
-      <w:r>
-        <w:rPr>
-          <w:sz w:val="22"/>
-          <w:szCs w:val="22"/>
-        </w:rPr>
-        <w:t xml:space="preserve">, with a principal address of 77824 Wildcat Dr., Palm Desert, CA 92211 (“Company”); and</w:t>
-      </w:r>
-    </w:p>
-    <w:p>
-      <w:pPr>
-        <w:spacing w:after="140"/>
-      </w:pPr>
-      <w:r>
-        <w:rPr>
-          <w:b/>
-          <w:bCs/>
-          <w:sz w:val="22"/>
-          <w:szCs w:val="22"/>
-        </w:rPr>
-        <w:t xml:space="preserve">Dominate Through Christ</w:t>
-      </w:r>
-      <w:r>
-        <w:rPr>
-          <w:sz w:val="22"/>
-          <w:szCs w:val="22"/>
-        </w:rPr>
-        <w:t xml:space="preserve"> (“DTC” or “Client”), a nonprofit organization whose application for recognition of tax-exempt status under Section 501(c)(3) of the Internal Revenue Code is currently pending, with a principal address of </w:t>
+        <w:t xml:space="preserve">[OWNER'S FULL LEGAL NAME]</w:t>
+      </w:r>
+      <w:r>
+        <w:rPr>
+          <w:sz w:val="22"/>
+          <w:szCs w:val="22"/>
+        </w:rPr>
+        <w:t xml:space="preserve">, with a principal address of </w:t>
       </w:r>
       <w:r>
         <w:rPr>
@@ -158,14 +137,35 @@
           <w:highlight w:val="yellow"/>
           <w:highlightCs w:val="yellow"/>
         </w:rPr>
-        <w:t xml:space="preserve">[CLIENT ADDRESS]</w:t>
-      </w:r>
-      <w:r>
-        <w:rPr>
-          <w:sz w:val="22"/>
-          <w:szCs w:val="22"/>
-        </w:rPr>
-        <w:t xml:space="preserve">.</w:t>
+        <w:t xml:space="preserve">[MISSION HUB INK ADDRESS]</w:t>
+      </w:r>
+      <w:r>
+        <w:rPr>
+          <w:sz w:val="22"/>
+          <w:szCs w:val="22"/>
+        </w:rPr>
+        <w:t xml:space="preserve"> (“Company”); and</w:t>
+      </w:r>
+    </w:p>
+    <w:p>
+      <w:pPr>
+        <w:spacing w:after="140"/>
+      </w:pPr>
+      <w:r>
+        <w:rPr>
+          <w:b/>
+          <w:bCs/>
+          <w:sz w:val="22"/>
+          <w:szCs w:val="22"/>
+        </w:rPr>
+        <w:t xml:space="preserve">Dominate Through Christ</w:t>
+      </w:r>
+      <w:r>
+        <w:rPr>
+          <w:sz w:val="22"/>
+          <w:szCs w:val="22"/>
+        </w:rPr>
+        <w:t xml:space="preserve"> (“DTC” or “Client”), a nonprofit organization whose application for recognition of tax-exempt status under Section 501(c)(3) of the Internal Revenue Code is currently pending, with a principal address of 77824 Wildcat Dr., Palm Desert, CA 92211.</w:t>
       </w:r>
     </w:p>
     <w:p>
@@ -413,7 +413,7 @@
           <w:sz w:val="22"/>
           <w:szCs w:val="22"/>
         </w:rPr>
-        <w:t xml:space="preserve">Website Development Fee. The total fee for the Website Development Services is a flat $500.00 (five hundred dollars), due in full (100%) prior to, or concurrent with, Company's commencement of work, or upon execution of this Agreement if the Website has already been delivered as of the Effective Date.</w:t>
+        <w:t xml:space="preserve">Website Development Fee. The total fee for the Website Development Services is a flat $500.00 (five hundred dollars), due in full (100%) prior to, or concurrent with, Company's commencement of work, or upon execution of this Agreement if the Website has already been delivered as of the Effective Date. This fee is payable by check made out to Company.</w:t>
       </w:r>
     </w:p>
     <w:p>
@@ -435,7 +435,7 @@
           <w:sz w:val="22"/>
           <w:szCs w:val="22"/>
         </w:rPr>
-        <w:t xml:space="preserve">Monthly Maintenance Fee. Client shall pay Company a recurring maintenance fee of $250.00 (two hundred fifty dollars) per month for the Maintenance Services described in Section 1.2, billed monthly in advance beginning on the Effective Date (or the Website's launch date, whichever is later), and on the same day of each month thereafter.</w:t>
+        <w:t xml:space="preserve">Monthly Maintenance Fee. Client shall pay Company a recurring maintenance fee of $250.00 (two hundred fifty dollars) per month for the Maintenance Services described in Section 1.2, billed monthly in advance beginning on the Effective Date (or the Website's launch date, whichever is later), and on the same day of each month thereafter. This fee is payable via Stripe, through a recurring subscription or invoice link Company provides to Client. Client is responsible for any transaction or processing fees charged by Stripe.</w:t>
       </w:r>
     </w:p>
     <w:p>
@@ -457,25 +457,7 @@
           <w:sz w:val="22"/>
           <w:szCs w:val="22"/>
         </w:rPr>
-        <w:t xml:space="preserve">Payment Method. Fees shall be paid by </w:t>
-      </w:r>
-      <w:r>
-        <w:rPr>
-          <w:b/>
-          <w:bCs/>
-          <w:sz w:val="22"/>
-          <w:szCs w:val="22"/>
-          <w:highlight w:val="yellow"/>
-          <w:highlightCs w:val="yellow"/>
-        </w:rPr>
-        <w:t xml:space="preserve">[PAYMENT METHOD — e.g., ACH, check, card, invoice]</w:t>
-      </w:r>
-      <w:r>
-        <w:rPr>
-          <w:sz w:val="22"/>
-          <w:szCs w:val="22"/>
-        </w:rPr>
-        <w:t xml:space="preserve">, payable to Company.</w:t>
+        <w:t xml:space="preserve">Change of Payment Method. Company may designate a different payment method or processor for either fee by giving Client at least fifteen (15) days' written notice.</w:t>
       </w:r>
     </w:p>
     <w:p>
@@ -1503,18 +1485,7 @@
                 <w:sz w:val="22"/>
                 <w:szCs w:val="22"/>
               </w:rPr>
-              <w:t xml:space="preserve">Title: </w:t>
-            </w:r>
-            <w:r>
-              <w:rPr>
-                <w:b/>
-                <w:bCs/>
-                <w:sz w:val="22"/>
-                <w:szCs w:val="22"/>
-                <w:highlight w:val="yellow"/>
-                <w:highlightCs w:val="yellow"/>
-              </w:rPr>
-              <w:t xml:space="preserve">[TITLE]</w:t>
+              <w:t xml:space="preserve">Title: Owner / Sole Proprietor</w:t>
             </w:r>
           </w:p>
         </w:tc>

</xml_diff>

<commit_message>
Add owner name, shared address, and no-affiliation clause
Names Lucas Harris as Mission Hub Ink's owner and reflects that both
parties share the same Palm Desert, CA address. Adds a "No Affiliation"
general provision (14.7) documenting that Lucas Harris holds no
governance role at DTC and that fees reflect arm's-length terms, given
the shared address and DTC's pending 501(c)(3) status.

Co-Authored-By: Claude Sonnet 5 <noreply@anthropic.com>
Claude-Session: https://claude.ai/code/session_01ARzF3gvMe1hgzDFCn9fbkn
</commit_message>
<xml_diff>
--- a/contracts/DTC-Website-Services-Agreement.docx
+++ b/contracts/DTC-Website-Services-Agreement.docx
@@ -108,43 +108,7 @@
           <w:sz w:val="22"/>
           <w:szCs w:val="22"/>
         </w:rPr>
-        <w:t xml:space="preserve">, a sole proprietorship operating under the trade name “Mission Hub Ink,” owned and operated by </w:t>
-      </w:r>
-      <w:r>
-        <w:rPr>
-          <w:b/>
-          <w:bCs/>
-          <w:sz w:val="22"/>
-          <w:szCs w:val="22"/>
-          <w:highlight w:val="yellow"/>
-          <w:highlightCs w:val="yellow"/>
-        </w:rPr>
-        <w:t xml:space="preserve">[OWNER'S FULL LEGAL NAME]</w:t>
-      </w:r>
-      <w:r>
-        <w:rPr>
-          <w:sz w:val="22"/>
-          <w:szCs w:val="22"/>
-        </w:rPr>
-        <w:t xml:space="preserve">, with a principal address of </w:t>
-      </w:r>
-      <w:r>
-        <w:rPr>
-          <w:b/>
-          <w:bCs/>
-          <w:sz w:val="22"/>
-          <w:szCs w:val="22"/>
-          <w:highlight w:val="yellow"/>
-          <w:highlightCs w:val="yellow"/>
-        </w:rPr>
-        <w:t xml:space="preserve">[MISSION HUB INK ADDRESS]</w:t>
-      </w:r>
-      <w:r>
-        <w:rPr>
-          <w:sz w:val="22"/>
-          <w:szCs w:val="22"/>
-        </w:rPr>
-        <w:t xml:space="preserve"> (“Company”); and</w:t>
+        <w:t xml:space="preserve">, a sole proprietorship operating under the trade name “Mission Hub Ink,” owned and operated by Lucas Harris, with a principal address of 77824 Wildcat Dr., Palm Desert, CA 92211 (“Company”); and</w:t>
       </w:r>
     </w:p>
     <w:p>
@@ -1246,6 +1210,28 @@
           <w:szCs w:val="22"/>
         </w:rPr>
         <w:t xml:space="preserve">Survival. Sections 5 (Ownership), 6 (Client Content), 9 (Confidentiality), 10–13 (Warranties, Liability, Indemnification, Force Majeure), and 14 (General Provisions) survive termination or cancellation of this Agreement.</w:t>
+      </w:r>
+    </w:p>
+    <w:p>
+      <w:pPr>
+        <w:spacing w:after="140"/>
+        <w:ind w:left="360"/>
+      </w:pPr>
+      <w:r>
+        <w:rPr>
+          <w:b/>
+          <w:bCs/>
+          <w:sz w:val="22"/>
+          <w:szCs w:val="22"/>
+        </w:rPr>
+        <w:t xml:space="preserve">14.7 </w:t>
+      </w:r>
+      <w:r>
+        <w:rPr>
+          <w:sz w:val="22"/>
+          <w:szCs w:val="22"/>
+        </w:rPr>
+        <w:t xml:space="preserve">No Affiliation. The Parties acknowledge that Company and Client share a common mailing address as a matter of convenience, but that Lucas Harris holds no board seat, officer position, or other governance role with Client, and that the fees set out in Section 2 reflect arm's-length terms for the Services described in this Agreement.</w:t>
       </w:r>
     </w:p>
     <w:p>
@@ -1414,18 +1400,7 @@
                 <w:sz w:val="22"/>
                 <w:szCs w:val="22"/>
               </w:rPr>
-              <w:t xml:space="preserve">Name: </w:t>
-            </w:r>
-            <w:r>
-              <w:rPr>
-                <w:b/>
-                <w:bCs/>
-                <w:sz w:val="22"/>
-                <w:szCs w:val="22"/>
-                <w:highlight w:val="yellow"/>
-                <w:highlightCs w:val="yellow"/>
-              </w:rPr>
-              <w:t xml:space="preserve">[NAME]</w:t>
+              <w:t xml:space="preserve">Name: Lucas Harris</w:t>
             </w:r>
           </w:p>
         </w:tc>

</xml_diff>